<commit_message>
Completed Week 3 Module 7 Spring XML
</commit_message>
<xml_diff>
--- a/Week3/Module 7 - Spring REST using Spring Boot 3/Module 7 output.docx
+++ b/Week3/Module 7 - Spring REST using Spring Boot 3/Module 7 output.docx
@@ -124,6 +124,80 @@
           </wp:inline>
         </w:drawing>
       </w:r>
+    </w:p>
+    <w:p>
+      <w:pPr>
+        <w:rPr>
+          <w:rFonts w:ascii="Arial" w:eastAsia="Times New Roman" w:hAnsi="Arial" w:cs="Arial"/>
+          <w:color w:val="333333"/>
+          <w:sz w:val="21"/>
+          <w:szCs w:val="21"/>
+          <w:shd w:val="clear" w:color="auto" w:fill="FFFFFF"/>
+        </w:rPr>
+      </w:pPr>
+      <w:r>
+        <w:rPr>
+          <w:rFonts w:ascii="Arial" w:eastAsia="Times New Roman" w:hAnsi="Arial" w:cs="Arial"/>
+          <w:b/>
+          <w:bCs/>
+          <w:color w:val="333333"/>
+          <w:sz w:val="36"/>
+          <w:szCs w:val="36"/>
+          <w:shd w:val="clear" w:color="auto" w:fill="FFFFFF"/>
+        </w:rPr>
+        <w:t>Spring Core – Load Country from Spring Configuration XML</w:t>
+      </w:r>
+      <w:r>
+        <w:rPr>
+          <w:rFonts w:ascii="Arial" w:eastAsia="Times New Roman" w:hAnsi="Arial" w:cs="Arial"/>
+          <w:color w:val="333333"/>
+          <w:sz w:val="21"/>
+          <w:szCs w:val="21"/>
+          <w:shd w:val="clear" w:color="auto" w:fill="FFFFFF"/>
+        </w:rPr>
+        <w:t> </w:t>
+      </w:r>
+    </w:p>
+    <w:p>
+      <w:r>
+        <w:drawing>
+          <wp:inline distT="0" distB="0" distL="0" distR="0" wp14:anchorId="16C57690" wp14:editId="077E2AB2">
+            <wp:extent cx="5731510" cy="2971690"/>
+            <wp:effectExtent l="0" t="0" r="2540" b="635"/>
+            <wp:docPr id="2" name="Picture 2"/>
+            <wp:cNvGraphicFramePr>
+              <a:graphicFrameLocks xmlns:a="http://schemas.openxmlformats.org/drawingml/2006/main" noChangeAspect="1"/>
+            </wp:cNvGraphicFramePr>
+            <a:graphic xmlns:a="http://schemas.openxmlformats.org/drawingml/2006/main">
+              <a:graphicData uri="http://schemas.openxmlformats.org/drawingml/2006/picture">
+                <pic:pic xmlns:pic="http://schemas.openxmlformats.org/drawingml/2006/picture">
+                  <pic:nvPicPr>
+                    <pic:cNvPr id="0" name=""/>
+                    <pic:cNvPicPr/>
+                  </pic:nvPicPr>
+                  <pic:blipFill>
+                    <a:blip r:embed="rId6"/>
+                    <a:stretch>
+                      <a:fillRect/>
+                    </a:stretch>
+                  </pic:blipFill>
+                  <pic:spPr>
+                    <a:xfrm>
+                      <a:off x="0" y="0"/>
+                      <a:ext cx="5731510" cy="2971690"/>
+                    </a:xfrm>
+                    <a:prstGeom prst="rect">
+                      <a:avLst/>
+                    </a:prstGeom>
+                  </pic:spPr>
+                </pic:pic>
+              </a:graphicData>
+            </a:graphic>
+          </wp:inline>
+        </w:drawing>
+      </w:r>
+    </w:p>
+    <w:p>
       <w:bookmarkStart w:id="0" w:name="_GoBack"/>
       <w:bookmarkEnd w:id="0"/>
     </w:p>

</xml_diff>

<commit_message>
Hello World RESTful Web Service
</commit_message>
<xml_diff>
--- a/Week3/Module 7 - Spring REST using Spring Boot 3/Module 7 output.docx
+++ b/Week3/Module 7 - Spring REST using Spring Boot 3/Module 7 output.docx
@@ -197,6 +197,191 @@
         </w:drawing>
       </w:r>
     </w:p>
+    <w:p>
+      <w:pPr>
+        <w:rPr>
+          <w:rFonts w:ascii="Arial" w:eastAsia="Times New Roman" w:hAnsi="Arial" w:cs="Arial"/>
+          <w:color w:val="333333"/>
+          <w:sz w:val="21"/>
+          <w:szCs w:val="21"/>
+          <w:shd w:val="clear" w:color="auto" w:fill="FFFFFF"/>
+        </w:rPr>
+      </w:pPr>
+      <w:r>
+        <w:rPr>
+          <w:rFonts w:ascii="Arial" w:eastAsia="Times New Roman" w:hAnsi="Arial" w:cs="Arial"/>
+          <w:b/>
+          <w:bCs/>
+          <w:color w:val="333333"/>
+          <w:sz w:val="36"/>
+          <w:szCs w:val="36"/>
+          <w:shd w:val="clear" w:color="auto" w:fill="FFFFFF"/>
+        </w:rPr>
+        <w:lastRenderedPageBreak/>
+        <w:t xml:space="preserve">Hello World </w:t>
+      </w:r>
+      <w:proofErr w:type="spellStart"/>
+      <w:r>
+        <w:rPr>
+          <w:rFonts w:ascii="Arial" w:eastAsia="Times New Roman" w:hAnsi="Arial" w:cs="Arial"/>
+          <w:b/>
+          <w:bCs/>
+          <w:color w:val="333333"/>
+          <w:sz w:val="36"/>
+          <w:szCs w:val="36"/>
+          <w:shd w:val="clear" w:color="auto" w:fill="FFFFFF"/>
+        </w:rPr>
+        <w:t>RESTful</w:t>
+      </w:r>
+      <w:proofErr w:type="spellEnd"/>
+      <w:r>
+        <w:rPr>
+          <w:rFonts w:ascii="Arial" w:eastAsia="Times New Roman" w:hAnsi="Arial" w:cs="Arial"/>
+          <w:b/>
+          <w:bCs/>
+          <w:color w:val="333333"/>
+          <w:sz w:val="36"/>
+          <w:szCs w:val="36"/>
+          <w:shd w:val="clear" w:color="auto" w:fill="FFFFFF"/>
+        </w:rPr>
+        <w:t xml:space="preserve"> Web Service</w:t>
+      </w:r>
+      <w:r>
+        <w:rPr>
+          <w:rFonts w:ascii="Arial" w:eastAsia="Times New Roman" w:hAnsi="Arial" w:cs="Arial"/>
+          <w:color w:val="333333"/>
+          <w:sz w:val="21"/>
+          <w:szCs w:val="21"/>
+          <w:shd w:val="clear" w:color="auto" w:fill="FFFFFF"/>
+        </w:rPr>
+        <w:t> </w:t>
+      </w:r>
+    </w:p>
+    <w:p>
+      <w:r>
+        <w:drawing>
+          <wp:inline distT="0" distB="0" distL="0" distR="0" wp14:anchorId="6E328BF9" wp14:editId="51000CA4">
+            <wp:extent cx="5731510" cy="2931888"/>
+            <wp:effectExtent l="0" t="0" r="2540" b="1905"/>
+            <wp:docPr id="3" name="Picture 3"/>
+            <wp:cNvGraphicFramePr>
+              <a:graphicFrameLocks xmlns:a="http://schemas.openxmlformats.org/drawingml/2006/main" noChangeAspect="1"/>
+            </wp:cNvGraphicFramePr>
+            <a:graphic xmlns:a="http://schemas.openxmlformats.org/drawingml/2006/main">
+              <a:graphicData uri="http://schemas.openxmlformats.org/drawingml/2006/picture">
+                <pic:pic xmlns:pic="http://schemas.openxmlformats.org/drawingml/2006/picture">
+                  <pic:nvPicPr>
+                    <pic:cNvPr id="0" name=""/>
+                    <pic:cNvPicPr/>
+                  </pic:nvPicPr>
+                  <pic:blipFill>
+                    <a:blip r:embed="rId7"/>
+                    <a:stretch>
+                      <a:fillRect/>
+                    </a:stretch>
+                  </pic:blipFill>
+                  <pic:spPr>
+                    <a:xfrm>
+                      <a:off x="0" y="0"/>
+                      <a:ext cx="5731510" cy="2931888"/>
+                    </a:xfrm>
+                    <a:prstGeom prst="rect">
+                      <a:avLst/>
+                    </a:prstGeom>
+                  </pic:spPr>
+                </pic:pic>
+              </a:graphicData>
+            </a:graphic>
+          </wp:inline>
+        </w:drawing>
+      </w:r>
+    </w:p>
+    <w:p>
+      <w:r>
+        <w:drawing>
+          <wp:inline distT="0" distB="0" distL="0" distR="0" wp14:anchorId="646A30EB" wp14:editId="1F28C6EA">
+            <wp:extent cx="5731071" cy="1104900"/>
+            <wp:effectExtent l="0" t="0" r="3175" b="0"/>
+            <wp:docPr id="4" name="Picture 4"/>
+            <wp:cNvGraphicFramePr>
+              <a:graphicFrameLocks xmlns:a="http://schemas.openxmlformats.org/drawingml/2006/main" noChangeAspect="1"/>
+            </wp:cNvGraphicFramePr>
+            <a:graphic xmlns:a="http://schemas.openxmlformats.org/drawingml/2006/main">
+              <a:graphicData uri="http://schemas.openxmlformats.org/drawingml/2006/picture">
+                <pic:pic xmlns:pic="http://schemas.openxmlformats.org/drawingml/2006/picture">
+                  <pic:nvPicPr>
+                    <pic:cNvPr id="0" name=""/>
+                    <pic:cNvPicPr/>
+                  </pic:nvPicPr>
+                  <pic:blipFill rotWithShape="1">
+                    <a:blip r:embed="rId8"/>
+                    <a:srcRect b="53226"/>
+                    <a:stretch/>
+                  </pic:blipFill>
+                  <pic:spPr bwMode="auto">
+                    <a:xfrm>
+                      <a:off x="0" y="0"/>
+                      <a:ext cx="5731510" cy="1104985"/>
+                    </a:xfrm>
+                    <a:prstGeom prst="rect">
+                      <a:avLst/>
+                    </a:prstGeom>
+                    <a:ln>
+                      <a:noFill/>
+                    </a:ln>
+                    <a:extLst>
+                      <a:ext uri="{53640926-AAD7-44D8-BBD7-CCE9431645EC}">
+                        <a14:shadowObscured xmlns:a14="http://schemas.microsoft.com/office/drawing/2010/main"/>
+                      </a:ext>
+                    </a:extLst>
+                  </pic:spPr>
+                </pic:pic>
+              </a:graphicData>
+            </a:graphic>
+          </wp:inline>
+        </w:drawing>
+      </w:r>
+    </w:p>
+    <w:p>
+      <w:r>
+        <w:drawing>
+          <wp:inline distT="0" distB="0" distL="0" distR="0" wp14:anchorId="71459DFE" wp14:editId="05DA0EE3">
+            <wp:extent cx="5731510" cy="3585255"/>
+            <wp:effectExtent l="0" t="0" r="2540" b="0"/>
+            <wp:docPr id="5" name="Picture 5"/>
+            <wp:cNvGraphicFramePr>
+              <a:graphicFrameLocks xmlns:a="http://schemas.openxmlformats.org/drawingml/2006/main" noChangeAspect="1"/>
+            </wp:cNvGraphicFramePr>
+            <a:graphic xmlns:a="http://schemas.openxmlformats.org/drawingml/2006/main">
+              <a:graphicData uri="http://schemas.openxmlformats.org/drawingml/2006/picture">
+                <pic:pic xmlns:pic="http://schemas.openxmlformats.org/drawingml/2006/picture">
+                  <pic:nvPicPr>
+                    <pic:cNvPr id="0" name=""/>
+                    <pic:cNvPicPr/>
+                  </pic:nvPicPr>
+                  <pic:blipFill>
+                    <a:blip r:embed="rId9"/>
+                    <a:stretch>
+                      <a:fillRect/>
+                    </a:stretch>
+                  </pic:blipFill>
+                  <pic:spPr>
+                    <a:xfrm>
+                      <a:off x="0" y="0"/>
+                      <a:ext cx="5731510" cy="3585255"/>
+                    </a:xfrm>
+                    <a:prstGeom prst="rect">
+                      <a:avLst/>
+                    </a:prstGeom>
+                  </pic:spPr>
+                </pic:pic>
+              </a:graphicData>
+            </a:graphic>
+          </wp:inline>
+        </w:drawing>
+      </w:r>
+    </w:p>
+    <w:p/>
     <w:p>
       <w:bookmarkStart w:id="0" w:name="_GoBack"/>
       <w:bookmarkEnd w:id="0"/>

</xml_diff>

<commit_message>
REST - Country Web Service
</commit_message>
<xml_diff>
--- a/Week3/Module 7 - Spring REST using Spring Boot 3/Module 7 output.docx
+++ b/Week3/Module 7 - Spring REST using Spring Boot 3/Module 7 output.docx
@@ -382,7 +382,162 @@
       </w:r>
     </w:p>
     <w:p/>
+    <w:p/>
     <w:p>
+      <w:pPr>
+        <w:rPr>
+          <w:sz w:val="36"/>
+        </w:rPr>
+      </w:pPr>
+      <w:r>
+        <w:rPr>
+          <w:rStyle w:val="Strong"/>
+          <w:sz w:val="36"/>
+        </w:rPr>
+        <w:lastRenderedPageBreak/>
+        <w:t>REST - Country Web Service</w:t>
+      </w:r>
+    </w:p>
+    <w:p>
+      <w:pPr>
+        <w:rPr>
+          <w:sz w:val="36"/>
+        </w:rPr>
+      </w:pPr>
+      <w:r>
+        <w:rPr>
+          <w:sz w:val="36"/>
+        </w:rPr>
+        <w:drawing>
+          <wp:inline distT="0" distB="0" distL="0" distR="0" wp14:anchorId="327292E8" wp14:editId="602CF2BB">
+            <wp:extent cx="5731510" cy="3043334"/>
+            <wp:effectExtent l="0" t="0" r="2540" b="5080"/>
+            <wp:docPr id="6" name="Picture 6"/>
+            <wp:cNvGraphicFramePr>
+              <a:graphicFrameLocks xmlns:a="http://schemas.openxmlformats.org/drawingml/2006/main" noChangeAspect="1"/>
+            </wp:cNvGraphicFramePr>
+            <a:graphic xmlns:a="http://schemas.openxmlformats.org/drawingml/2006/main">
+              <a:graphicData uri="http://schemas.openxmlformats.org/drawingml/2006/picture">
+                <pic:pic xmlns:pic="http://schemas.openxmlformats.org/drawingml/2006/picture">
+                  <pic:nvPicPr>
+                    <pic:cNvPr id="0" name=""/>
+                    <pic:cNvPicPr/>
+                  </pic:nvPicPr>
+                  <pic:blipFill>
+                    <a:blip r:embed="rId10"/>
+                    <a:stretch>
+                      <a:fillRect/>
+                    </a:stretch>
+                  </pic:blipFill>
+                  <pic:spPr>
+                    <a:xfrm>
+                      <a:off x="0" y="0"/>
+                      <a:ext cx="5731510" cy="3043334"/>
+                    </a:xfrm>
+                    <a:prstGeom prst="rect">
+                      <a:avLst/>
+                    </a:prstGeom>
+                  </pic:spPr>
+                </pic:pic>
+              </a:graphicData>
+            </a:graphic>
+          </wp:inline>
+        </w:drawing>
+      </w:r>
+    </w:p>
+    <w:p>
+      <w:pPr>
+        <w:rPr>
+          <w:sz w:val="36"/>
+        </w:rPr>
+      </w:pPr>
+      <w:r>
+        <w:rPr>
+          <w:sz w:val="36"/>
+        </w:rPr>
+        <w:drawing>
+          <wp:inline distT="0" distB="0" distL="0" distR="0" wp14:anchorId="42E493AE" wp14:editId="334AFDCA">
+            <wp:extent cx="5731510" cy="1195902"/>
+            <wp:effectExtent l="0" t="0" r="2540" b="4445"/>
+            <wp:docPr id="7" name="Picture 7"/>
+            <wp:cNvGraphicFramePr>
+              <a:graphicFrameLocks xmlns:a="http://schemas.openxmlformats.org/drawingml/2006/main" noChangeAspect="1"/>
+            </wp:cNvGraphicFramePr>
+            <a:graphic xmlns:a="http://schemas.openxmlformats.org/drawingml/2006/main">
+              <a:graphicData uri="http://schemas.openxmlformats.org/drawingml/2006/picture">
+                <pic:pic xmlns:pic="http://schemas.openxmlformats.org/drawingml/2006/picture">
+                  <pic:nvPicPr>
+                    <pic:cNvPr id="0" name=""/>
+                    <pic:cNvPicPr/>
+                  </pic:nvPicPr>
+                  <pic:blipFill>
+                    <a:blip r:embed="rId11"/>
+                    <a:stretch>
+                      <a:fillRect/>
+                    </a:stretch>
+                  </pic:blipFill>
+                  <pic:spPr>
+                    <a:xfrm>
+                      <a:off x="0" y="0"/>
+                      <a:ext cx="5731510" cy="1195902"/>
+                    </a:xfrm>
+                    <a:prstGeom prst="rect">
+                      <a:avLst/>
+                    </a:prstGeom>
+                  </pic:spPr>
+                </pic:pic>
+              </a:graphicData>
+            </a:graphic>
+          </wp:inline>
+        </w:drawing>
+      </w:r>
+    </w:p>
+    <w:p>
+      <w:pPr>
+        <w:rPr>
+          <w:sz w:val="36"/>
+        </w:rPr>
+      </w:pPr>
+      <w:r>
+        <w:rPr>
+          <w:sz w:val="36"/>
+        </w:rPr>
+        <w:drawing>
+          <wp:inline distT="0" distB="0" distL="0" distR="0" wp14:anchorId="51D4BF5E" wp14:editId="15B33406">
+            <wp:extent cx="5731510" cy="3320112"/>
+            <wp:effectExtent l="0" t="0" r="2540" b="0"/>
+            <wp:docPr id="8" name="Picture 8"/>
+            <wp:cNvGraphicFramePr>
+              <a:graphicFrameLocks xmlns:a="http://schemas.openxmlformats.org/drawingml/2006/main" noChangeAspect="1"/>
+            </wp:cNvGraphicFramePr>
+            <a:graphic xmlns:a="http://schemas.openxmlformats.org/drawingml/2006/main">
+              <a:graphicData uri="http://schemas.openxmlformats.org/drawingml/2006/picture">
+                <pic:pic xmlns:pic="http://schemas.openxmlformats.org/drawingml/2006/picture">
+                  <pic:nvPicPr>
+                    <pic:cNvPr id="0" name=""/>
+                    <pic:cNvPicPr/>
+                  </pic:nvPicPr>
+                  <pic:blipFill>
+                    <a:blip r:embed="rId12"/>
+                    <a:stretch>
+                      <a:fillRect/>
+                    </a:stretch>
+                  </pic:blipFill>
+                  <pic:spPr>
+                    <a:xfrm>
+                      <a:off x="0" y="0"/>
+                      <a:ext cx="5731510" cy="3320112"/>
+                    </a:xfrm>
+                    <a:prstGeom prst="rect">
+                      <a:avLst/>
+                    </a:prstGeom>
+                  </pic:spPr>
+                </pic:pic>
+              </a:graphicData>
+            </a:graphic>
+          </wp:inline>
+        </w:drawing>
+      </w:r>
       <w:bookmarkStart w:id="0" w:name="_GoBack"/>
       <w:bookmarkEnd w:id="0"/>
     </w:p>
@@ -621,6 +776,17 @@
       <w:lang w:val="en-US"/>
     </w:rPr>
   </w:style>
+  <w:style w:type="character" w:styleId="Strong">
+    <w:name w:val="Strong"/>
+    <w:basedOn w:val="DefaultParagraphFont"/>
+    <w:uiPriority w:val="22"/>
+    <w:qFormat/>
+    <w:rsid w:val="00CF5ADD"/>
+    <w:rPr>
+      <w:b/>
+      <w:bCs/>
+    </w:rPr>
+  </w:style>
 </w:styles>
 </file>
 
@@ -847,6 +1013,17 @@
       <w:sz w:val="16"/>
       <w:szCs w:val="16"/>
       <w:lang w:val="en-US"/>
+    </w:rPr>
+  </w:style>
+  <w:style w:type="character" w:styleId="Strong">
+    <w:name w:val="Strong"/>
+    <w:basedOn w:val="DefaultParagraphFont"/>
+    <w:uiPriority w:val="22"/>
+    <w:qFormat/>
+    <w:rsid w:val="00CF5ADD"/>
+    <w:rPr>
+      <w:b/>
+      <w:bCs/>
     </w:rPr>
   </w:style>
 </w:styles>

</xml_diff>

<commit_message>
REST - Get country based on country code
</commit_message>
<xml_diff>
--- a/Week3/Module 7 - Spring REST using Spring Boot 3/Module 7 output.docx
+++ b/Week3/Module 7 - Spring REST using Spring Boot 3/Module 7 output.docx
@@ -538,6 +538,195 @@
           </wp:inline>
         </w:drawing>
       </w:r>
+    </w:p>
+    <w:p>
+      <w:pPr>
+        <w:rPr>
+          <w:sz w:val="36"/>
+        </w:rPr>
+      </w:pPr>
+    </w:p>
+    <w:p>
+      <w:pPr>
+        <w:rPr>
+          <w:rFonts w:ascii="Arial" w:eastAsia="Times New Roman" w:hAnsi="Arial" w:cs="Arial"/>
+          <w:color w:val="333333"/>
+          <w:sz w:val="21"/>
+          <w:szCs w:val="21"/>
+          <w:shd w:val="clear" w:color="auto" w:fill="FFFFFF"/>
+        </w:rPr>
+      </w:pPr>
+      <w:r>
+        <w:rPr>
+          <w:rFonts w:ascii="Arial" w:eastAsia="Times New Roman" w:hAnsi="Arial" w:cs="Arial"/>
+          <w:b/>
+          <w:bCs/>
+          <w:color w:val="333333"/>
+          <w:sz w:val="36"/>
+          <w:szCs w:val="36"/>
+          <w:shd w:val="clear" w:color="auto" w:fill="FFFFFF"/>
+        </w:rPr>
+        <w:lastRenderedPageBreak/>
+        <w:t>REST - Get country based on country code</w:t>
+      </w:r>
+      <w:r>
+        <w:rPr>
+          <w:rFonts w:ascii="Arial" w:eastAsia="Times New Roman" w:hAnsi="Arial" w:cs="Arial"/>
+          <w:color w:val="333333"/>
+          <w:sz w:val="21"/>
+          <w:szCs w:val="21"/>
+          <w:shd w:val="clear" w:color="auto" w:fill="FFFFFF"/>
+        </w:rPr>
+        <w:t> </w:t>
+      </w:r>
+    </w:p>
+    <w:p>
+      <w:pPr>
+        <w:rPr>
+          <w:sz w:val="36"/>
+        </w:rPr>
+      </w:pPr>
+      <w:r>
+        <w:rPr>
+          <w:sz w:val="36"/>
+        </w:rPr>
+        <w:drawing>
+          <wp:inline distT="0" distB="0" distL="0" distR="0" wp14:anchorId="6597B03F" wp14:editId="54AB07B2">
+            <wp:extent cx="5731510" cy="2024399"/>
+            <wp:effectExtent l="0" t="0" r="2540" b="0"/>
+            <wp:docPr id="9" name="Picture 9"/>
+            <wp:cNvGraphicFramePr>
+              <a:graphicFrameLocks xmlns:a="http://schemas.openxmlformats.org/drawingml/2006/main" noChangeAspect="1"/>
+            </wp:cNvGraphicFramePr>
+            <a:graphic xmlns:a="http://schemas.openxmlformats.org/drawingml/2006/main">
+              <a:graphicData uri="http://schemas.openxmlformats.org/drawingml/2006/picture">
+                <pic:pic xmlns:pic="http://schemas.openxmlformats.org/drawingml/2006/picture">
+                  <pic:nvPicPr>
+                    <pic:cNvPr id="0" name=""/>
+                    <pic:cNvPicPr/>
+                  </pic:nvPicPr>
+                  <pic:blipFill>
+                    <a:blip r:embed="rId13"/>
+                    <a:stretch>
+                      <a:fillRect/>
+                    </a:stretch>
+                  </pic:blipFill>
+                  <pic:spPr>
+                    <a:xfrm>
+                      <a:off x="0" y="0"/>
+                      <a:ext cx="5731510" cy="2024399"/>
+                    </a:xfrm>
+                    <a:prstGeom prst="rect">
+                      <a:avLst/>
+                    </a:prstGeom>
+                  </pic:spPr>
+                </pic:pic>
+              </a:graphicData>
+            </a:graphic>
+          </wp:inline>
+        </w:drawing>
+      </w:r>
+    </w:p>
+    <w:p>
+      <w:pPr>
+        <w:rPr>
+          <w:sz w:val="36"/>
+        </w:rPr>
+      </w:pPr>
+      <w:r>
+        <w:rPr>
+          <w:sz w:val="36"/>
+        </w:rPr>
+        <w:drawing>
+          <wp:inline distT="0" distB="0" distL="0" distR="0" wp14:anchorId="35E9403B" wp14:editId="707CD4CD">
+            <wp:extent cx="5731510" cy="1235091"/>
+            <wp:effectExtent l="0" t="0" r="2540" b="3175"/>
+            <wp:docPr id="10" name="Picture 10"/>
+            <wp:cNvGraphicFramePr>
+              <a:graphicFrameLocks xmlns:a="http://schemas.openxmlformats.org/drawingml/2006/main" noChangeAspect="1"/>
+            </wp:cNvGraphicFramePr>
+            <a:graphic xmlns:a="http://schemas.openxmlformats.org/drawingml/2006/main">
+              <a:graphicData uri="http://schemas.openxmlformats.org/drawingml/2006/picture">
+                <pic:pic xmlns:pic="http://schemas.openxmlformats.org/drawingml/2006/picture">
+                  <pic:nvPicPr>
+                    <pic:cNvPr id="0" name=""/>
+                    <pic:cNvPicPr/>
+                  </pic:nvPicPr>
+                  <pic:blipFill>
+                    <a:blip r:embed="rId14"/>
+                    <a:stretch>
+                      <a:fillRect/>
+                    </a:stretch>
+                  </pic:blipFill>
+                  <pic:spPr>
+                    <a:xfrm>
+                      <a:off x="0" y="0"/>
+                      <a:ext cx="5731510" cy="1235091"/>
+                    </a:xfrm>
+                    <a:prstGeom prst="rect">
+                      <a:avLst/>
+                    </a:prstGeom>
+                  </pic:spPr>
+                </pic:pic>
+              </a:graphicData>
+            </a:graphic>
+          </wp:inline>
+        </w:drawing>
+      </w:r>
+    </w:p>
+    <w:p>
+      <w:pPr>
+        <w:rPr>
+          <w:sz w:val="36"/>
+        </w:rPr>
+      </w:pPr>
+      <w:r>
+        <w:rPr>
+          <w:sz w:val="36"/>
+        </w:rPr>
+        <w:drawing>
+          <wp:inline distT="0" distB="0" distL="0" distR="0" wp14:anchorId="023F8356" wp14:editId="5A9A923F">
+            <wp:extent cx="5731510" cy="1999905"/>
+            <wp:effectExtent l="0" t="0" r="2540" b="635"/>
+            <wp:docPr id="11" name="Picture 11"/>
+            <wp:cNvGraphicFramePr>
+              <a:graphicFrameLocks xmlns:a="http://schemas.openxmlformats.org/drawingml/2006/main" noChangeAspect="1"/>
+            </wp:cNvGraphicFramePr>
+            <a:graphic xmlns:a="http://schemas.openxmlformats.org/drawingml/2006/main">
+              <a:graphicData uri="http://schemas.openxmlformats.org/drawingml/2006/picture">
+                <pic:pic xmlns:pic="http://schemas.openxmlformats.org/drawingml/2006/picture">
+                  <pic:nvPicPr>
+                    <pic:cNvPr id="0" name=""/>
+                    <pic:cNvPicPr/>
+                  </pic:nvPicPr>
+                  <pic:blipFill>
+                    <a:blip r:embed="rId15"/>
+                    <a:stretch>
+                      <a:fillRect/>
+                    </a:stretch>
+                  </pic:blipFill>
+                  <pic:spPr>
+                    <a:xfrm>
+                      <a:off x="0" y="0"/>
+                      <a:ext cx="5731510" cy="1999905"/>
+                    </a:xfrm>
+                    <a:prstGeom prst="rect">
+                      <a:avLst/>
+                    </a:prstGeom>
+                  </pic:spPr>
+                </pic:pic>
+              </a:graphicData>
+            </a:graphic>
+          </wp:inline>
+        </w:drawing>
+      </w:r>
+    </w:p>
+    <w:p>
+      <w:pPr>
+        <w:rPr>
+          <w:sz w:val="36"/>
+        </w:rPr>
+      </w:pPr>
       <w:bookmarkStart w:id="0" w:name="_GoBack"/>
       <w:bookmarkEnd w:id="0"/>
     </w:p>

</xml_diff>